<commit_message>
refactor: improve mux scheduling checks and overflow observability
Agent-Logs-Url: https://github.com/leng-peng/leidazuoye/sessions/660c0775-3827-47b9-90eb-b53f7321b5eb

Co-authored-by: leng-peng <252009236+leng-peng@users.noreply.github.com>
</commit_message>
<xml_diff>
--- a/学号_姓名_课程设计.docx
+++ b/学号_姓名_课程设计.docx
@@ -91,7 +91,7 @@
     </w:p>
     <w:p>
       <w:r>
-        <w:t>（3）输出侧在88MHz域按A优先、B次之、空帧兜底策略连续发送32bit帧。</w:t>
+        <w:t>（3）输出侧在88MHz域采用轮询策略：A/B同时非空时交替发送，单路有效时直接发送；双路为空时发送空帧。</w:t>
       </w:r>
     </w:p>
     <w:p>
@@ -134,17 +134,22 @@
     </w:p>
     <w:p>
       <w:r>
-        <w:t>- 输出调度与串行发送；</w:t>
+        <w:t>- 88MHz域轮询调度与串行发送；</w:t>
       </w:r>
     </w:p>
     <w:p>
       <w:r>
-        <w:t>- 空帧填充机制。</w:t>
+        <w:t>- 空帧填充机制；</w:t>
       </w:r>
     </w:p>
     <w:p>
       <w:r>
-        <w:t>4.3 tb_async_data_mux.v：仿真激励与统计，构造A/B并发输入并统计输出A/B/空帧数量。</w:t>
+        <w:t>- FIFO溢出监测输出（overflow_a/overflow_b）用于完整性告警。</w:t>
+      </w:r>
+    </w:p>
+    <w:p>
+      <w:r>
+        <w:t>4.3 tb_async_data_mux.v：仿真激励与统计，构造A/B并发输入并统计输出A/B/空帧数量及有效载荷校验和。</w:t>
       </w:r>
     </w:p>
     <w:p>
@@ -190,7 +195,7 @@
     </w:p>
     <w:p>
       <w:r>
-        <w:t>（3）资源优化：采用统一32bit帧缓存、参数化FIFO结构，逻辑简单、可综合性好。</w:t>
+        <w:t>（3）资源优化：采用统一32bit帧缓存与参数化FIFO结构，逻辑简单、可综合性好。</w:t>
       </w:r>
     </w:p>
     <w:p>
@@ -203,7 +208,7 @@
     </w:p>
     <w:p>
       <w:r>
-        <w:t>自主设计思路：先根据速率约束确定必须跨域缓存，再选择帧级缓冲与固定长度调度策略，保证实现简单与稳定。</w:t>
+        <w:t>自主设计思路：先根据速率约束确定跨域缓存需求，再选择帧级缓冲与固定长度调度策略，保证实现简单与稳定。</w:t>
       </w:r>
     </w:p>
     <w:p>

</xml_diff>